<commit_message>
Phase 2 apply + 43 NO_REFS bulk fix + TEMPLATE mandatory Tham khao + organize Grummitt PDF + Kieling HTML + 7 Lancet Psych PDFs (canonical 131 entries)
</commit_message>
<xml_diff>
--- a/Tom-tat-tung-bai/QT001_Jenkins_et_al_2023_USA.docx
+++ b/Tom-tat-tung-bai/QT001_Jenkins_et_al_2023_USA.docx
@@ -598,6 +598,69 @@
         <w:t>Bảng 2. Yếu tố liên quan — Jenkins et al. 2023</w:t>
       </w:r>
     </w:p>
+    <w:p/>
+    <w:p>
+      <w:pPr>
+        <w:spacing w:line="360" w:lineRule="auto"/>
+      </w:pPr>
+      <w:r>
+        <w:rPr>
+          <w:rFonts w:ascii="Times New Roman" w:hAnsi="Times New Roman"/>
+          <w:b/>
+          <w:sz w:val="26"/>
+        </w:rPr>
+        <w:t>Tham khao</w:t>
+      </w:r>
+    </w:p>
+    <w:p>
+      <w:pPr>
+        <w:spacing w:line="360" w:lineRule="auto"/>
+      </w:pPr>
+      <w:r>
+        <w:rPr>
+          <w:rFonts w:ascii="Times New Roman" w:hAnsi="Times New Roman"/>
+          <w:sz w:val="24"/>
+        </w:rPr>
+        <w:t>Jenkins et al. (2023). [Tieu de bai bao: [khong co trong canonical]]. [Tap chi/Nguon: [khong co trong canonical]], [vol/issue/pages: [khong co trong canonical]].</w:t>
+      </w:r>
+    </w:p>
+    <w:p>
+      <w:pPr>
+        <w:spacing w:line="360" w:lineRule="auto"/>
+      </w:pPr>
+      <w:r>
+        <w:rPr>
+          <w:rFonts w:ascii="Times New Roman" w:hAnsi="Times New Roman"/>
+          <w:sz w:val="24"/>
+        </w:rPr>
+        <w:t>PDF path: 02_Papers-goc/11-bai-ban-dau-va-mo-rong/QT001_Jenkins_2023_USA_SanDiego.pdf</w:t>
+      </w:r>
+    </w:p>
+    <w:p>
+      <w:pPr>
+        <w:spacing w:line="360" w:lineRule="auto"/>
+      </w:pPr>
+      <w:r>
+        <w:rPr>
+          <w:rFonts w:ascii="Times New Roman" w:hAnsi="Times New Roman"/>
+          <w:sz w:val="24"/>
+        </w:rPr>
+        <w:t>DOI: [khong co trong canonical] | PMID: [khong co trong canonical]</w:t>
+      </w:r>
+    </w:p>
+    <w:p/>
+    <w:p>
+      <w:pPr>
+        <w:spacing w:line="360" w:lineRule="auto"/>
+      </w:pPr>
+      <w:r>
+        <w:rPr>
+          <w:rFonts w:ascii="Times New Roman" w:hAnsi="Times New Roman"/>
+          <w:sz w:val="24"/>
+        </w:rPr>
+        <w:t>Bo sung Tham khao 07/06/2026 (auto-fill tu canonical_index)</w:t>
+      </w:r>
+    </w:p>
     <w:sectPr>
       <w:pgSz w:w="12240" w:h="15840"/>
       <w:pgMar w:top="1417" w:right="1134" w:bottom="1417" w:left="1701" w:header="720" w:footer="720" w:gutter="0"/>

</xml_diff>